<commit_message>
feat: improve public website and Cloudinary configuration
</commit_message>
<xml_diff>
--- a/docs/doc_dasar_done/PRD.docx
+++ b/docs/doc_dasar_done/PRD.docx
@@ -71,86 +71,6 @@
           <w:bCs/>
         </w:rPr>
         <w:t xml:space="preserve"> Desa Karang Sidemen, Lombok Tengah</w:t>
-      </w:r>
-    </w:p>
-    <w:p>
-      <w:proofErr w:type="spellStart"/>
-      <w:r>
-        <w:rPr>
-          <w:b/>
-          <w:bCs/>
-        </w:rPr>
-        <w:t>Versi</w:t>
-      </w:r>
-      <w:proofErr w:type="spellEnd"/>
-      <w:r>
-        <w:rPr>
-          <w:b/>
-          <w:bCs/>
-        </w:rPr>
-        <w:t>:</w:t>
-      </w:r>
-      <w:r>
-        <w:t> 2.0 (Final)</w:t>
-      </w:r>
-      <w:r>
-        <w:br/>
-      </w:r>
-      <w:proofErr w:type="spellStart"/>
-      <w:r>
-        <w:rPr>
-          <w:b/>
-          <w:bCs/>
-        </w:rPr>
-        <w:t>Tanggal</w:t>
-      </w:r>
-      <w:proofErr w:type="spellEnd"/>
-      <w:r>
-        <w:rPr>
-          <w:b/>
-          <w:bCs/>
-        </w:rPr>
-        <w:t>:</w:t>
-      </w:r>
-      <w:r>
-        <w:t> 31 Mei 2026</w:t>
-      </w:r>
-      <w:r>
-        <w:br/>
-      </w:r>
-      <w:r>
-        <w:rPr>
-          <w:b/>
-          <w:bCs/>
-        </w:rPr>
-        <w:t>Status:</w:t>
-      </w:r>
-      <w:r>
-        <w:t xml:space="preserve"> Final – </w:t>
-      </w:r>
-      <w:proofErr w:type="spellStart"/>
-      <w:r>
-        <w:t>siap</w:t>
-      </w:r>
-      <w:proofErr w:type="spellEnd"/>
-      <w:r>
-        <w:t xml:space="preserve"> </w:t>
-      </w:r>
-      <w:proofErr w:type="spellStart"/>
-      <w:r>
-        <w:t>dipecah</w:t>
-      </w:r>
-      <w:proofErr w:type="spellEnd"/>
-      <w:r>
-        <w:t xml:space="preserve"> </w:t>
-      </w:r>
-      <w:proofErr w:type="spellStart"/>
-      <w:r>
-        <w:t>ke</w:t>
-      </w:r>
-      <w:proofErr w:type="spellEnd"/>
-      <w:r>
-        <w:t xml:space="preserve"> Issues</w:t>
       </w:r>
     </w:p>
     <w:p/>
@@ -269,42 +189,7 @@
             <w:vAlign w:val="center"/>
             <w:hideMark/>
           </w:tcPr>
-          <w:p>
-            <w:r>
-              <w:rPr>
-                <w:b/>
-                <w:bCs/>
-              </w:rPr>
-              <w:t>SIKADES</w:t>
-            </w:r>
-            <w:r>
-              <w:t xml:space="preserve"> – </w:t>
-            </w:r>
-            <w:proofErr w:type="spellStart"/>
-            <w:r>
-              <w:t>Sistem</w:t>
-            </w:r>
-            <w:proofErr w:type="spellEnd"/>
-            <w:r>
-              <w:t xml:space="preserve"> </w:t>
-            </w:r>
-            <w:proofErr w:type="spellStart"/>
-            <w:r>
-              <w:t>Informasi</w:t>
-            </w:r>
-            <w:proofErr w:type="spellEnd"/>
-            <w:r>
-              <w:t xml:space="preserve"> </w:t>
-            </w:r>
-            <w:proofErr w:type="spellStart"/>
-            <w:r>
-              <w:t>Wisata</w:t>
-            </w:r>
-            <w:proofErr w:type="spellEnd"/>
-            <w:r>
-              <w:t xml:space="preserve"> Karang Sidemen</w:t>
-            </w:r>
-          </w:p>
+          <w:p/>
         </w:tc>
       </w:tr>
       <w:tr>
@@ -1564,7 +1449,6 @@
           <w:b/>
           <w:bCs/>
         </w:rPr>
-        <w:lastRenderedPageBreak/>
         <w:t>Catatan</w:t>
       </w:r>
       <w:proofErr w:type="spellEnd"/>
@@ -1637,6 +1521,7 @@
     <w:p>
       <w:proofErr w:type="spellStart"/>
       <w:r>
+        <w:lastRenderedPageBreak/>
         <w:t>Sistem</w:t>
       </w:r>
       <w:proofErr w:type="spellEnd"/>
@@ -2158,13 +2043,13 @@
         </w:numPr>
       </w:pPr>
       <w:r>
-        <w:lastRenderedPageBreak/>
         <w:t>Settings</w:t>
       </w:r>
     </w:p>
     <w:p>
       <w:proofErr w:type="spellStart"/>
       <w:r>
+        <w:lastRenderedPageBreak/>
         <w:t>Petugas</w:t>
       </w:r>
       <w:proofErr w:type="spellEnd"/>
@@ -2284,7 +2169,6 @@
           <w:b/>
           <w:bCs/>
         </w:rPr>
-        <w:lastRenderedPageBreak/>
         <w:t>3. FITUR PER MODUL (V1)</w:t>
       </w:r>
     </w:p>
@@ -2300,6 +2184,7 @@
           <w:b/>
           <w:bCs/>
         </w:rPr>
+        <w:lastRenderedPageBreak/>
         <w:t>3.1 LANDING PAGE (Publik)</w:t>
       </w:r>
     </w:p>
@@ -3493,7 +3378,6 @@
     </w:p>
     <w:p>
       <w:r>
-        <w:lastRenderedPageBreak/>
         <w:t>Status booking V1:</w:t>
       </w:r>
     </w:p>
@@ -3505,6 +3389,7 @@
         </w:numPr>
       </w:pPr>
       <w:r>
+        <w:lastRenderedPageBreak/>
         <w:t>pending</w:t>
       </w:r>
     </w:p>
@@ -4642,7 +4527,6 @@
         </w:numPr>
       </w:pPr>
       <w:r>
-        <w:lastRenderedPageBreak/>
         <w:t xml:space="preserve">Nama dan </w:t>
       </w:r>
       <w:proofErr w:type="spellStart"/>
@@ -4719,6 +4603,7 @@
       </w:pPr>
       <w:proofErr w:type="spellStart"/>
       <w:r>
+        <w:lastRenderedPageBreak/>
         <w:t>Destinasi</w:t>
       </w:r>
       <w:proofErr w:type="spellEnd"/>
@@ -5979,7 +5864,6 @@
             </w:pPr>
             <w:proofErr w:type="spellStart"/>
             <w:r>
-              <w:lastRenderedPageBreak/>
               <w:t>pengeluaran</w:t>
             </w:r>
             <w:proofErr w:type="spellEnd"/>
@@ -5990,6 +5874,7 @@
             </w:pPr>
             <w:proofErr w:type="spellStart"/>
             <w:r>
+              <w:lastRenderedPageBreak/>
               <w:t>Sistem</w:t>
             </w:r>
             <w:proofErr w:type="spellEnd"/>
@@ -7467,7 +7352,6 @@
         </w:numPr>
       </w:pPr>
       <w:r>
-        <w:lastRenderedPageBreak/>
         <w:t>No. WhatsApp (</w:t>
       </w:r>
       <w:proofErr w:type="spellStart"/>
@@ -7487,6 +7371,7 @@
         </w:numPr>
       </w:pPr>
       <w:r>
+        <w:lastRenderedPageBreak/>
         <w:t xml:space="preserve">Asal </w:t>
       </w:r>
       <w:proofErr w:type="spellStart"/>
@@ -8696,7 +8581,6 @@
           <w:b/>
           <w:bCs/>
         </w:rPr>
-        <w:lastRenderedPageBreak/>
         <w:t>Landing page slider:</w:t>
       </w:r>
       <w:r>
@@ -10018,7 +9902,15 @@
             </w:r>
             <w:proofErr w:type="spellEnd"/>
             <w:r>
-              <w:t xml:space="preserve"> bersamaan.</w:t>
+              <w:t xml:space="preserve"> </w:t>
+            </w:r>
+            <w:proofErr w:type="spellStart"/>
+            <w:r>
+              <w:t>bersamaan</w:t>
+            </w:r>
+            <w:proofErr w:type="spellEnd"/>
+            <w:r>
+              <w:t>.</w:t>
             </w:r>
           </w:p>
           <w:p/>
@@ -11776,7 +11668,6 @@
           <w:b/>
           <w:bCs/>
         </w:rPr>
-        <w:lastRenderedPageBreak/>
         <w:t>6. TECH STACK (UNTUK DISKUSI DENGAN CLAUDE)</w:t>
       </w:r>
     </w:p>
@@ -11787,6 +11678,7 @@
           <w:b/>
           <w:bCs/>
         </w:rPr>
+        <w:lastRenderedPageBreak/>
         <w:t>Catatan</w:t>
       </w:r>
       <w:proofErr w:type="spellEnd"/>
@@ -12347,15 +12239,7 @@
       </w:r>
       <w:proofErr w:type="spellEnd"/>
       <w:r>
-        <w:t xml:space="preserve"> </w:t>
-      </w:r>
-      <w:proofErr w:type="spellStart"/>
-      <w:r>
-        <w:t>nanti</w:t>
-      </w:r>
-      <w:proofErr w:type="spellEnd"/>
-      <w:r>
-        <w:t>.</w:t>
+        <w:t xml:space="preserve"> nanti.</w:t>
       </w:r>
     </w:p>
     <w:p/>
@@ -12515,7 +12399,6 @@
           <w:b/>
           <w:bCs/>
         </w:rPr>
-        <w:lastRenderedPageBreak/>
         <w:t>7. HAL YANG DI LUAR SCOPE (V1)</w:t>
       </w:r>
     </w:p>
@@ -12541,6 +12424,7 @@
           </w:tcPr>
           <w:p>
             <w:r>
+              <w:lastRenderedPageBreak/>
               <w:t>No</w:t>
             </w:r>
           </w:p>
@@ -17971,6 +17855,7 @@
   <w:style w:type="character" w:default="1" w:styleId="DefaultParagraphFont">
     <w:name w:val="Default Paragraph Font"/>
     <w:uiPriority w:val="1"/>
+    <w:semiHidden/>
     <w:unhideWhenUsed/>
   </w:style>
   <w:style w:type="table" w:default="1" w:styleId="TableNormal">

</xml_diff>